<commit_message>
Remove Autotrade and quant projects from the portfolio.
Drop those listings, related copy, and assets so the site and resume only show current work.

Co-authored-by: Cursor <cursoragent@cursor.com>
</commit_message>
<xml_diff>
--- a/public/resume.docx
+++ b/public/resume.docx
@@ -62,7 +62,7 @@
         </w:numPr>
       </w:pPr>
       <w:r>
-        <w:t>Interned at two early-stage tech startups this year, shipping an AI tutoring agent and architecting a trading bot from 0 to beta.</w:t>
+        <w:t>Interned at an early-stage tech startup this year, shipping an AI tutoring agent.</w:t>
       </w:r>
     </w:p>
     <w:p>
@@ -277,80 +277,6 @@
       </w:pPr>
       <w:r>
         <w:t>Flew to Toronto for a 5-day onsite sprint in July; attended 2 investor meetings, filmed and edited UGC marketing content, and represented the company at offsite industry events.</w:t>
-      </w:r>
-    </w:p>
-    <w:p>
-      <w:pPr>
-        <w:tabs>
-          <w:tab w:val="right" w:pos="10800"/>
-        </w:tabs>
-        <w:spacing w:before="60"/>
-      </w:pPr>
-      <w:proofErr w:type="spellStart"/>
-      <w:r>
-        <w:rPr>
-          <w:b/>
-          <w:bCs/>
-        </w:rPr>
-        <w:t>Autotrade</w:t>
-      </w:r>
-      <w:proofErr w:type="spellEnd"/>
-      <w:r>
-        <w:tab/>
-      </w:r>
-      <w:hyperlink r:id="rId5" w:history="1">
-        <w:r>
-          <w:rPr>
-            <w:rStyle w:val="Hyperlink"/>
-            <w:b/>
-            <w:bCs/>
-          </w:rPr>
-          <w:t>tryautotrade.com</w:t>
-        </w:r>
-      </w:hyperlink>
-    </w:p>
-    <w:p>
-      <w:pPr>
-        <w:tabs>
-          <w:tab w:val="right" w:pos="10800"/>
-        </w:tabs>
-        <w:spacing w:after="40"/>
-      </w:pPr>
-      <w:r>
-        <w:rPr>
-          <w:i/>
-          <w:iCs/>
-        </w:rPr>
-        <w:t>Chief Technical Officer</w:t>
-      </w:r>
-      <w:r>
-        <w:tab/>
-      </w:r>
-      <w:r>
-        <w:rPr>
-          <w:i/>
-          <w:iCs/>
-        </w:rPr>
-        <w:t>5</w:t>
-      </w:r>
-      <w:r>
-        <w:rPr>
-          <w:i/>
-          <w:iCs/>
-        </w:rPr>
-        <w:t>/2026 – Present</w:t>
-      </w:r>
-    </w:p>
-    <w:p>
-      <w:pPr>
-        <w:pStyle w:val="ListParagraph"/>
-        <w:numPr>
-          <w:ilvl w:val="0"/>
-          <w:numId w:val="2"/>
-        </w:numPr>
-      </w:pPr>
-      <w:r>
-        <w:t>Architecting a reinforcement-learning trading bot (Alpaca API, Sentry, Stripe, Clerk) that refines its strategy against its own trade history; shipped MVP in one week, now in closed beta.</w:t>
       </w:r>
     </w:p>
     <w:p>

</xml_diff>

<commit_message>
Add errorbroker and refresh portfolio copy from the july resume.
Rename x-combinator to z-combinator, sienna to riverstone, and ship the new resume plus errorbroker project with github/npm/marketplace links.

Co-authored-by: Cursor <cursoragent@cursor.com>
</commit_message>
<xml_diff>
--- a/public/resume.docx
+++ b/public/resume.docx
@@ -62,7 +62,7 @@
         </w:numPr>
       </w:pPr>
       <w:r>
-        <w:t>Interned at an early-stage tech startup this year, shipping an AI tutoring agent.</w:t>
+        <w:t>Interned at two early-stage tech startups this year, shipping an AI tutoring agent and architecting a trading bot from 0 to beta.</w:t>
       </w:r>
     </w:p>
     <w:p>
@@ -310,7 +310,14 @@
           <w:b/>
           <w:bCs/>
         </w:rPr>
-        <w:t>X-Combinator</w:t>
+        <w:t xml:space="preserve">Z </w:t>
+      </w:r>
+      <w:r>
+        <w:rPr>
+          <w:b/>
+          <w:bCs/>
+        </w:rPr>
+        <w:t>Combinator</w:t>
       </w:r>
       <w:r>
         <w:tab/>
@@ -449,7 +456,7 @@
       <w:r>
         <w:t xml:space="preserve">  •  </w:t>
       </w:r>
-      <w:hyperlink r:id="rId6" w:history="1">
+      <w:hyperlink r:id="rId5" w:history="1">
         <w:r>
           <w:rPr>
             <w:color w:val="0563C1"/>
@@ -517,13 +524,15 @@
         </w:tabs>
         <w:spacing w:before="60"/>
       </w:pPr>
-      <w:r>
-        <w:rPr>
-          <w:b/>
-          <w:bCs/>
-        </w:rPr>
-        <w:t>Pingry Research and Innovation in Modern Engineering (PRIME)</w:t>
-      </w:r>
+      <w:proofErr w:type="spellStart"/>
+      <w:r>
+        <w:rPr>
+          <w:b/>
+          <w:bCs/>
+        </w:rPr>
+        <w:t>CodeNinjas</w:t>
+      </w:r>
+      <w:proofErr w:type="spellEnd"/>
       <w:r>
         <w:tab/>
       </w:r>
@@ -532,7 +541,21 @@
           <w:b/>
           <w:bCs/>
         </w:rPr>
-        <w:t>The Pingry School, NJ</w:t>
+        <w:t>Riverstone</w:t>
+      </w:r>
+      <w:r>
+        <w:rPr>
+          <w:b/>
+          <w:bCs/>
+        </w:rPr>
+        <w:t xml:space="preserve">, </w:t>
+      </w:r>
+      <w:r>
+        <w:rPr>
+          <w:b/>
+          <w:bCs/>
+        </w:rPr>
+        <w:t>TX</w:t>
       </w:r>
     </w:p>
     <w:p>
@@ -1795,6 +1818,7 @@
   <w:style w:type="character" w:default="1" w:styleId="DefaultParagraphFont">
     <w:name w:val="Default Paragraph Font"/>
     <w:uiPriority w:val="1"/>
+    <w:semiHidden/>
     <w:unhideWhenUsed/>
   </w:style>
   <w:style w:type="table" w:default="1" w:styleId="TableNormal">

</xml_diff>